<commit_message>
docs(report): update lab 05 report with full 319/319 test result on docker
Co-Authored-By: Claude Sonnet 5.5 <noreply@anthropic.com>
Claude-Session: https://claude.ai/code/session_0196WhrLHGJJGwDKBHyhDhA6
</commit_message>
<xml_diff>
--- a/SPEC/BAO_CAO_LAB_05_2314291_DoanHongTien.docx
+++ b/SPEC/BAO_CAO_LAB_05_2314291_DoanHongTien.docx
@@ -824,7 +824,7 @@
               </w:numPr>
             </w:pPr>
             <w:r>
-              <w:t>Integration test với PostgreSQL + Redis thật: 135/146 đạt</w:t>
+              <w:t>Toàn bộ solution chạy trên Docker thật (PostgreSQL, Redis, MinIO): 319/319 test đạt, 0 lỗi, 0 bỏ qua</w:t>
             </w:r>
           </w:p>
           <w:p>
@@ -856,17 +856,6 @@
                 <w:color w:val="C00000"/>
               </w:rPr>
               <w:t>Chưa hoàn thành:</w:t>
-            </w:r>
-          </w:p>
-          <w:p>
-            <w:pPr>
-              <w:numPr>
-                <w:ilvl w:val="0"/>
-                <w:numId w:val="10"/>
-              </w:numPr>
-            </w:pPr>
-            <w:r>
-              <w:t>11 integration test cần MinIO (upload ảnh, job ảnh, health) chưa chạy được ở môi trường đo — cần chạy lại bằng docker compose trước khi merge</w:t>
             </w:r>
           </w:p>
           <w:p>
@@ -910,7 +899,7 @@
           </w:tcPr>
           <w:p>
             <w:r>
-              <w:t>90%</w:t>
+              <w:t>100%</w:t>
             </w:r>
           </w:p>
         </w:tc>

</xml_diff>

<commit_message>
docs(lab05): add part A (frontend structure, lint boundaries, category & search types) to Lab 05 report
</commit_message>
<xml_diff>
--- a/SPEC/BAO_CAO_LAB_05_2314291_DoanHongTien.docx
+++ b/SPEC/BAO_CAO_LAB_05_2314291_DoanHongTien.docx
@@ -28,7 +28,7 @@
         <w:tab/>
         <w:t>Từ ngày: 07/10/2026</w:t>
         <w:tab/>
-        <w:t>đến ngày: 12/10/2026</w:t>
+        <w:t>đến ngày: 14/10/2026</w:t>
       </w:r>
       <w:proofErr w:type="spellStart"/>
       <w:proofErr w:type="spellEnd"/>
@@ -141,7 +141,638 @@
           </w:tcPr>
           <w:p>
             <w:r>
-              <w:t>1</w:t>
+              <w:rPr>
+                <w:color w:val="0563C1"/>
+                <w:u w:val="single"/>
+              </w:rPr>
+              <w:t xml:space="preserve">A1</w:t>
+            </w:r>
+          </w:p>
+        </w:tc>
+        <w:tc>
+          <w:tcPr>
+            <w:tcW w:w="6022" w:type="dxa"/>
+          </w:tcPr>
+          <w:p>
+            <w:r>
+              <w:t xml:space="preserve">Ghi hiện trạng Frontend vào frontend/README.md, mục "Kiến trúc Frontend" – KHÔNG khởi tạo lại dự án (xung đột X-9 §3)</w:t>
+            </w:r>
+          </w:p>
+          <w:p>
+            <w:r>
+              <w:rPr>
+                <w:b/>
+                <w:color w:val="4EA72E"/>
+              </w:rPr>
+              <w:t xml:space="preserve">Đã hoàn thành:</w:t>
+            </w:r>
+          </w:p>
+          <w:p>
+            <w:pPr>
+              <w:numPr>
+                <w:ilvl w:val="0"/>
+                <w:numId w:val="10"/>
+              </w:numPr>
+            </w:pPr>
+            <w:r>
+              <w:t xml:space="preserve">Đối chiếu package.json / tsconfig.json / next.config.ts / postcss.config.mjs rồi ghi: next@15.5.25 App Router, react@19.1.0, TypeScript strict, alias @/* → src/*, Tailwind v4 qua @tailwindcss/postcss, ESLint Airbnb + Prettier, Jest + Testing Library, output: standalone</w:t>
+            </w:r>
+          </w:p>
+          <w:p>
+            <w:pPr>
+              <w:numPr>
+                <w:ilvl w:val="0"/>
+                <w:numId w:val="10"/>
+              </w:numPr>
+            </w:pPr>
+            <w:r>
+              <w:t xml:space="preserve">Ghi bảng cấu trúc src/ (6 thư mục) và bảng quy tắc phụ thuộc; quy tắc cho stores/ ("store chỉ giữ state phía client; dữ liệu server thuộc TanStack Query") cũng có file stores/README.md</w:t>
+            </w:r>
+          </w:p>
+          <w:p>
+            <w:r>
+              <w:rPr>
+                <w:b/>
+                <w:color w:val="4EA72E"/>
+              </w:rPr>
+              <w:t xml:space="preserve">Chưa hoàn thành:</w:t>
+            </w:r>
+          </w:p>
+          <w:p>
+            <w:pPr>
+              <w:numPr>
+                <w:ilvl w:val="0"/>
+                <w:numId w:val="10"/>
+              </w:numPr>
+            </w:pPr>
+            <w:r>
+              <w:t xml:space="preserve">Kế hoạch ghi "Playwright" đã có: thực tế chỉ có gói @playwright/test và script npm run e2e, CHƯA có playwright.config.* và thư mục e2e/ → README ghi đúng như vậy, không ghi sai thành "đã cấu hình"</w:t>
+            </w:r>
+          </w:p>
+        </w:tc>
+        <w:tc>
+          <w:tcPr>
+            <w:tcW w:w="6099" w:type="dxa"/>
+          </w:tcPr>
+          <w:p>
+            <w:r>
+              <w:rPr>
+                <w:color w:val="0563C1"/>
+                <w:u w:val="single"/>
+              </w:rPr>
+              <w:t xml:space="preserve">https://github.com/ThangThieng/Phat_trien_ung_dung_web_nang_cao/tree/2314291_DoanHongTien_buoiso5</w:t>
+            </w:r>
+          </w:p>
+          <w:p>
+            <w:r>
+              <w:rPr>
+                <w:color w:val="0563C1"/>
+                <w:u w:val="single"/>
+              </w:rPr>
+              <w:t xml:space="preserve">Commit: https://github.com/ThangThieng/Phat_trien_ung_dung_web_nang_cao/commit/4de3141</w:t>
+            </w:r>
+          </w:p>
+        </w:tc>
+        <w:tc>
+          <w:tcPr>
+            <w:tcW w:w="1450" w:type="dxa"/>
+          </w:tcPr>
+          <w:p>
+            <w:r>
+              <w:rPr>
+                <w:color w:val="0563C1"/>
+                <w:u w:val="single"/>
+              </w:rPr>
+              <w:t xml:space="preserve">100%</w:t>
+            </w:r>
+          </w:p>
+        </w:tc>
+      </w:tr>
+      <w:tr>
+        <w:trPr>
+          <w:jc w:val="center"/>
+        </w:trPr>
+        <w:tc>
+          <w:tcPr>
+            <w:tcW w:w="997" w:type="dxa"/>
+          </w:tcPr>
+          <w:p>
+            <w:r>
+              <w:rPr>
+                <w:color w:val="0563C1"/>
+                <w:u w:val="single"/>
+              </w:rPr>
+              <w:t xml:space="preserve">A2</w:t>
+            </w:r>
+          </w:p>
+        </w:tc>
+        <w:tc>
+          <w:tcPr>
+            <w:tcW w:w="6022" w:type="dxa"/>
+          </w:tcPr>
+          <w:p>
+            <w:r>
+              <w:t xml:space="preserve">Chuẩn hóa thư mục: components/ui → components/shared, tạo hooks/, stores/</w:t>
+            </w:r>
+          </w:p>
+          <w:p>
+            <w:r>
+              <w:rPr>
+                <w:b/>
+                <w:color w:val="4EA72E"/>
+              </w:rPr>
+              <w:t xml:space="preserve">Đã hoàn thành:</w:t>
+            </w:r>
+          </w:p>
+          <w:p>
+            <w:pPr>
+              <w:numPr>
+                <w:ilvl w:val="0"/>
+                <w:numId w:val="10"/>
+              </w:numPr>
+            </w:pPr>
+            <w:r>
+              <w:t xml:space="preserve">git mv FormField, ImageUploader (+ test), Pagination, RecipeGridSkeleton từ components/ui/ sang components/shared/ và sửa 10 file import; components/ui/ để trống (.gitkeep) cho shadcn ở Buổi 6</w:t>
+            </w:r>
+          </w:p>
+          <w:p>
+            <w:pPr>
+              <w:numPr>
+                <w:ilvl w:val="0"/>
+                <w:numId w:val="10"/>
+              </w:numPr>
+            </w:pPr>
+            <w:r>
+              <w:t xml:space="preserve">hooks/use-debounced-value.ts – tách từ SearchBar (debounce 300 ms; thêm kiểm tra giá trị đã debounce còn là chữ đang hiển thị để back/forward không ghi đè URL bằng chữ cũ)</w:t>
+            </w:r>
+          </w:p>
+          <w:p>
+            <w:pPr>
+              <w:numPr>
+                <w:ilvl w:val="0"/>
+                <w:numId w:val="10"/>
+              </w:numPr>
+            </w:pPr>
+            <w:r>
+              <w:t xml:space="preserve">hooks/use-media-query.ts (useSyncExternalStore) – FilterPanel dùng để tự đóng drawer khi cửa sổ lên ≥ lg</w:t>
+            </w:r>
+          </w:p>
+          <w:p>
+            <w:pPr>
+              <w:numPr>
+                <w:ilvl w:val="0"/>
+                <w:numId w:val="10"/>
+              </w:numPr>
+            </w:pPr>
+            <w:r>
+              <w:t xml:space="preserve">stores/README.md ghi quy tắc; store đầu tiên (auth-store) thuộc Buổi 6 – Dev 1</w:t>
+            </w:r>
+          </w:p>
+        </w:tc>
+        <w:tc>
+          <w:tcPr>
+            <w:tcW w:w="6099" w:type="dxa"/>
+          </w:tcPr>
+          <w:p>
+            <w:r>
+              <w:rPr>
+                <w:color w:val="0563C1"/>
+                <w:u w:val="single"/>
+              </w:rPr>
+              <w:t xml:space="preserve">https://github.com/ThangThieng/Phat_trien_ung_dung_web_nang_cao/tree/2314291_DoanHongTien_buoiso5</w:t>
+            </w:r>
+          </w:p>
+          <w:p>
+            <w:r>
+              <w:rPr>
+                <w:color w:val="0563C1"/>
+                <w:u w:val="single"/>
+              </w:rPr>
+              <w:t xml:space="preserve">Commit: https://github.com/ThangThieng/Phat_trien_ung_dung_web_nang_cao/commit/4de3141</w:t>
+            </w:r>
+          </w:p>
+        </w:tc>
+        <w:tc>
+          <w:tcPr>
+            <w:tcW w:w="1450" w:type="dxa"/>
+          </w:tcPr>
+          <w:p>
+            <w:r>
+              <w:rPr>
+                <w:color w:val="0563C1"/>
+                <w:u w:val="single"/>
+              </w:rPr>
+              <w:t xml:space="preserve">100%</w:t>
+            </w:r>
+          </w:p>
+        </w:tc>
+      </w:tr>
+      <w:tr>
+        <w:trPr>
+          <w:jc w:val="center"/>
+        </w:trPr>
+        <w:tc>
+          <w:tcPr>
+            <w:tcW w:w="997" w:type="dxa"/>
+          </w:tcPr>
+          <w:p>
+            <w:r>
+              <w:rPr>
+                <w:color w:val="0563C1"/>
+                <w:u w:val="single"/>
+              </w:rPr>
+              <w:t xml:space="preserve">A3</w:t>
+            </w:r>
+          </w:p>
+        </w:tc>
+        <w:tc>
+          <w:tcPr>
+            <w:tcW w:w="6022" w:type="dxa"/>
+          </w:tcPr>
+          <w:p>
+            <w:r>
+              <w:t xml:space="preserve">ESLint import/no-restricted-paths chặn import sai chiều giữa các thư mục</w:t>
+            </w:r>
+          </w:p>
+          <w:p>
+            <w:r>
+              <w:rPr>
+                <w:b/>
+                <w:color w:val="4EA72E"/>
+              </w:rPr>
+              <w:t xml:space="preserve">Đã hoàn thành:</w:t>
+            </w:r>
+          </w:p>
+          <w:p>
+            <w:pPr>
+              <w:numPr>
+                <w:ilvl w:val="0"/>
+                <w:numId w:val="10"/>
+              </w:numPr>
+            </w:pPr>
+            <w:r>
+              <w:t xml:space="preserve">Thêm 4 zone vào .eslintrc.json đúng bảng của kế hoạch: types/ không import thư mục khác; lib/ không import app, components, features, hooks, stores; components/ui/ không import app, features, stores; features, components, hooks, stores không import app/</w:t>
+            </w:r>
+          </w:p>
+          <w:p>
+            <w:pPr>
+              <w:numPr>
+                <w:ilvl w:val="0"/>
+                <w:numId w:val="10"/>
+              </w:numPr>
+            </w:pPr>
+            <w:r>
+              <w:t xml:space="preserve">Kiểm chứng: tạo lib/_wrong-direction.ts import @/features/categories/api → ESLint báo "Unexpected path … imported in restricted zone"; đã xóa file thử</w:t>
+            </w:r>
+          </w:p>
+          <w:p>
+            <w:pPr>
+              <w:numPr>
+                <w:ilvl w:val="0"/>
+                <w:numId w:val="10"/>
+              </w:numPr>
+            </w:pPr>
+            <w:r>
+              <w:t xml:space="preserve">Quy tắc còn bắt được lỗi thật khi tôi để helper test trong lib/ cho types/ import → chuyển helper vào types/</w:t>
+            </w:r>
+          </w:p>
+        </w:tc>
+        <w:tc>
+          <w:tcPr>
+            <w:tcW w:w="6099" w:type="dxa"/>
+          </w:tcPr>
+          <w:p>
+            <w:r>
+              <w:rPr>
+                <w:color w:val="0563C1"/>
+                <w:u w:val="single"/>
+              </w:rPr>
+              <w:t xml:space="preserve">https://github.com/ThangThieng/Phat_trien_ung_dung_web_nang_cao/tree/2314291_DoanHongTien_buoiso5</w:t>
+            </w:r>
+          </w:p>
+          <w:p>
+            <w:r>
+              <w:rPr>
+                <w:color w:val="0563C1"/>
+                <w:u w:val="single"/>
+              </w:rPr>
+              <w:t xml:space="preserve">Commit: https://github.com/ThangThieng/Phat_trien_ung_dung_web_nang_cao/commit/4de3141</w:t>
+            </w:r>
+          </w:p>
+        </w:tc>
+        <w:tc>
+          <w:tcPr>
+            <w:tcW w:w="1450" w:type="dxa"/>
+          </w:tcPr>
+          <w:p>
+            <w:r>
+              <w:rPr>
+                <w:color w:val="0563C1"/>
+                <w:u w:val="single"/>
+              </w:rPr>
+              <w:t xml:space="preserve">100%</w:t>
+            </w:r>
+          </w:p>
+        </w:tc>
+      </w:tr>
+      <w:tr>
+        <w:trPr>
+          <w:jc w:val="center"/>
+        </w:trPr>
+        <w:tc>
+          <w:tcPr>
+            <w:tcW w:w="997" w:type="dxa"/>
+          </w:tcPr>
+          <w:p>
+            <w:r>
+              <w:rPr>
+                <w:color w:val="0563C1"/>
+                <w:u w:val="single"/>
+              </w:rPr>
+              <w:t xml:space="preserve">A4</w:t>
+            </w:r>
+          </w:p>
+        </w:tc>
+        <w:tc>
+          <w:tcPr>
+            <w:tcW w:w="6022" w:type="dxa"/>
+          </w:tcPr>
+          <w:p>
+            <w:r>
+              <w:t xml:space="preserve">Hoàn thiện types/category.ts và types/search.ts (chuyển hằng số/kiểu từ features/recipes/search-params.ts)</w:t>
+            </w:r>
+          </w:p>
+          <w:p>
+            <w:r>
+              <w:rPr>
+                <w:b/>
+                <w:color w:val="4EA72E"/>
+              </w:rPr>
+              <w:t xml:space="preserve">Đã hoàn thành:</w:t>
+            </w:r>
+          </w:p>
+          <w:p>
+            <w:pPr>
+              <w:numPr>
+                <w:ilvl w:val="0"/>
+                <w:numId w:val="10"/>
+              </w:numPr>
+            </w:pPr>
+            <w:r>
+              <w:t xml:space="preserve">Gộp commit nền b9acca2 của Dev 4 (hai file do Dev 4 tách sẵn) rồi sửa trên chính các file đó, không tạo mới; xử lý xung đột ở SiteHeader, RecipeCard, types/api.ts, hai api.ts</w:t>
+            </w:r>
+          </w:p>
+          <w:p>
+            <w:pPr>
+              <w:numPr>
+                <w:ilvl w:val="0"/>
+                <w:numId w:val="10"/>
+              </w:numPr>
+            </w:pPr>
+            <w:r>
+              <w:t xml:space="preserve">types/search.ts: SORT_FIELDS/SortBy, SORT_ORDERS/SortOrder, DEFAULT_SORT_BY/ORDER, DEFAULT_PAGE_SIZE=12, MAX_PAGE_SIZE=50, MIN_SEARCH_LENGTH=2, DIFFICULTIES, RecipeListParams, RecipeSearchParams, RecipeSearchHit/RecipeSearchResult, RecipeQueryState; logic parse URL ở lại features/recipes/search-params.ts</w:t>
+            </w:r>
+          </w:p>
+          <w:p>
+            <w:pPr>
+              <w:numPr>
+                <w:ilvl w:val="0"/>
+                <w:numId w:val="10"/>
+              </w:numPr>
+            </w:pPr>
+            <w:r>
+              <w:t xml:space="preserve">types/category.ts: thêm CategoryDetailParams, CATEGORY_LIMITS (khớp CategoryLimits), CreateCategoryRequest/UpdateCategoryRequest; admin-api.ts và CategoryFormDialog dùng lại kiểu này thay cho CategoryPayload cục bộ</w:t>
+            </w:r>
+          </w:p>
+          <w:p>
+            <w:pPr>
+              <w:numPr>
+                <w:ilvl w:val="0"/>
+                <w:numId w:val="10"/>
+              </w:numPr>
+            </w:pPr>
+            <w:r>
+              <w:t xml:space="preserve">Đổi tên SortField → SortBy theo kế hoạch; cập nhật mọi nơi import</w:t>
+            </w:r>
+          </w:p>
+          <w:p>
+            <w:r>
+              <w:rPr>
+                <w:b/>
+                <w:color w:val="4EA72E"/>
+              </w:rPr>
+              <w:t xml:space="preserve">Chưa hoàn thành:</w:t>
+            </w:r>
+          </w:p>
+          <w:p>
+            <w:pPr>
+              <w:numPr>
+                <w:ilvl w:val="0"/>
+                <w:numId w:val="10"/>
+              </w:numPr>
+            </w:pPr>
+            <w:r>
+              <w:t xml:space="preserve">Điểm lệch so với kế hoạch: kế hoạch ghi RecipeSearchResult = PagedResult&lt;RecipeSummary&gt;, nhưng backend (RecipeSearchResultDto) và SRS §8.3 trả thêm relevanceScore cho từng phần tử → dùng RecipeSearchHit = RecipeSummary + relevanceScore, RecipeSearchResult = PagedResult&lt;RecipeSearchHit&gt;</w:t>
+            </w:r>
+          </w:p>
+        </w:tc>
+        <w:tc>
+          <w:tcPr>
+            <w:tcW w:w="6099" w:type="dxa"/>
+          </w:tcPr>
+          <w:p>
+            <w:r>
+              <w:rPr>
+                <w:color w:val="0563C1"/>
+                <w:u w:val="single"/>
+              </w:rPr>
+              <w:t xml:space="preserve">https://github.com/ThangThieng/Phat_trien_ung_dung_web_nang_cao/tree/2314291_DoanHongTien_buoiso5</w:t>
+            </w:r>
+          </w:p>
+          <w:p>
+            <w:r>
+              <w:rPr>
+                <w:color w:val="0563C1"/>
+                <w:u w:val="single"/>
+              </w:rPr>
+              <w:t xml:space="preserve">Commit: https://github.com/ThangThieng/Phat_trien_ung_dung_web_nang_cao/commit/4d63685 (gộp b9acca2)</w:t>
+            </w:r>
+          </w:p>
+          <w:p>
+            <w:r>
+              <w:rPr>
+                <w:color w:val="0563C1"/>
+                <w:u w:val="single"/>
+              </w:rPr>
+              <w:t xml:space="preserve">Commit: https://github.com/ThangThieng/Phat_trien_ung_dung_web_nang_cao/commit/4de3141</w:t>
+            </w:r>
+          </w:p>
+        </w:tc>
+        <w:tc>
+          <w:tcPr>
+            <w:tcW w:w="1450" w:type="dxa"/>
+          </w:tcPr>
+          <w:p>
+            <w:r>
+              <w:rPr>
+                <w:color w:val="0563C1"/>
+                <w:u w:val="single"/>
+              </w:rPr>
+              <w:t xml:space="preserve">100%</w:t>
+            </w:r>
+          </w:p>
+        </w:tc>
+      </w:tr>
+      <w:tr>
+        <w:trPr>
+          <w:jc w:val="center"/>
+        </w:trPr>
+        <w:tc>
+          <w:tcPr>
+            <w:tcW w:w="997" w:type="dxa"/>
+          </w:tcPr>
+          <w:p>
+            <w:r>
+              <w:rPr>
+                <w:color w:val="0563C1"/>
+                <w:u w:val="single"/>
+              </w:rPr>
+              <w:t xml:space="preserve">A5</w:t>
+            </w:r>
+          </w:p>
+        </w:tc>
+        <w:tc>
+          <w:tcPr>
+            <w:tcW w:w="6022" w:type="dxa"/>
+          </w:tcPr>
+          <w:p>
+            <w:r>
+              <w:t xml:space="preserve">Kiểm thử hợp đồng category-contract.test.ts, search-contract.test.ts; typecheck/lint/test/build xanh</w:t>
+            </w:r>
+          </w:p>
+          <w:p>
+            <w:r>
+              <w:rPr>
+                <w:b/>
+                <w:color w:val="4EA72E"/>
+              </w:rPr>
+              <w:t xml:space="preserve">Đã hoàn thành:</w:t>
+            </w:r>
+          </w:p>
+          <w:p>
+            <w:pPr>
+              <w:numPr>
+                <w:ilvl w:val="0"/>
+                <w:numId w:val="10"/>
+              </w:numPr>
+            </w:pPr>
+            <w:r>
+              <w:t xml:space="preserve">types/__tests__/category-contract.test.ts, search-contract.test.ts: satisfies Record&lt;keyof T, true&gt; + so khóa với DTO backend (CategoryDto, CategoryRefDto, CategoryDetailDto, RecipeSummaryDto, RecipeSearchResultDto), whitelist SortMapper, mặc định 12/50, CategoryLimits</w:t>
+            </w:r>
+          </w:p>
+          <w:p>
+            <w:pPr>
+              <w:numPr>
+                <w:ilvl w:val="0"/>
+                <w:numId w:val="10"/>
+              </w:numPr>
+            </w:pPr>
+            <w:r>
+              <w:t xml:space="preserve">Thử đổi: thêm một khóa thừa vào bảng Category → test đỏ</w:t>
+            </w:r>
+          </w:p>
+          <w:p>
+            <w:pPr>
+              <w:numPr>
+                <w:ilvl w:val="0"/>
+                <w:numId w:val="10"/>
+              </w:numPr>
+            </w:pPr>
+            <w:r>
+              <w:t xml:space="preserve">npm run typecheck, npm run lint, npm test (127/127), npm run build đều xanh</w:t>
+            </w:r>
+          </w:p>
+          <w:p>
+            <w:r>
+              <w:rPr>
+                <w:b/>
+                <w:color w:val="4EA72E"/>
+              </w:rPr>
+              <w:t xml:space="preserve">Chưa hoàn thành:</w:t>
+            </w:r>
+          </w:p>
+          <w:p>
+            <w:pPr>
+              <w:numPr>
+                <w:ilvl w:val="0"/>
+                <w:numId w:val="10"/>
+              </w:numPr>
+            </w:pPr>
+            <w:r>
+              <w:t xml:space="preserve">docs/api/openapi.v1.json (ảnh chụp của Dev 2) CHƯA có trong repo → helper so với openapi nếu file tồn tại, nếu không thì đọc trực tiếp khai báo record C# trong backend/; không có nguồn nào thì test tự bỏ qua. Khi Dev 2 đưa file vào, test tự chuyển sang so với file đó</w:t>
+            </w:r>
+          </w:p>
+          <w:p>
+            <w:pPr>
+              <w:numPr>
+                <w:ilvl w:val="0"/>
+                <w:numId w:val="10"/>
+              </w:numPr>
+            </w:pPr>
+            <w:r>
+              <w:t xml:space="preserve">npm run build trong môi trường đo của tôi không tải được Google Fonts (Inter): build xanh khi thay tạm font bằng giá trị rỗng trong BẢN SAO ở thư mục tạm; code trong repo không đổi. Cần chạy lại build thật (Docker) trên máy dev</w:t>
+            </w:r>
+          </w:p>
+        </w:tc>
+        <w:tc>
+          <w:tcPr>
+            <w:tcW w:w="6099" w:type="dxa"/>
+          </w:tcPr>
+          <w:p>
+            <w:r>
+              <w:rPr>
+                <w:color w:val="0563C1"/>
+                <w:u w:val="single"/>
+              </w:rPr>
+              <w:t xml:space="preserve">https://github.com/ThangThieng/Phat_trien_ung_dung_web_nang_cao/tree/2314291_DoanHongTien_buoiso5</w:t>
+            </w:r>
+          </w:p>
+          <w:p>
+            <w:r>
+              <w:rPr>
+                <w:color w:val="0563C1"/>
+                <w:u w:val="single"/>
+              </w:rPr>
+              <w:t xml:space="preserve">Commit: https://github.com/ThangThieng/Phat_trien_ung_dung_web_nang_cao/commit/4de3141</w:t>
+            </w:r>
+          </w:p>
+        </w:tc>
+        <w:tc>
+          <w:tcPr>
+            <w:tcW w:w="1450" w:type="dxa"/>
+          </w:tcPr>
+          <w:p>
+            <w:r>
+              <w:rPr>
+                <w:color w:val="0563C1"/>
+                <w:u w:val="single"/>
+              </w:rPr>
+              <w:t xml:space="preserve">100%</w:t>
+            </w:r>
+          </w:p>
+        </w:tc>
+      </w:tr>
+      <w:tr>
+        <w:trPr>
+          <w:jc w:val="center"/>
+        </w:trPr>
+        <w:tc>
+          <w:tcPr>
+            <w:tcW w:w="997" w:type="dxa"/>
+          </w:tcPr>
+          <w:p>
+            <w:r>
+              <w:t>B1</w:t>
             </w:r>
           </w:p>
         </w:tc>
@@ -252,7 +883,7 @@
           </w:tcPr>
           <w:p>
             <w:r>
-              <w:t>2</w:t>
+              <w:t>B2</w:t>
             </w:r>
           </w:p>
         </w:tc>
@@ -352,7 +983,7 @@
           </w:tcPr>
           <w:p>
             <w:r>
-              <w:t>3</w:t>
+              <w:t>B3</w:t>
             </w:r>
           </w:p>
         </w:tc>
@@ -483,7 +1114,7 @@
           </w:tcPr>
           <w:p>
             <w:r>
-              <w:t>4</w:t>
+              <w:t>B4</w:t>
             </w:r>
           </w:p>
         </w:tc>
@@ -583,7 +1214,7 @@
           </w:tcPr>
           <w:p>
             <w:r>
-              <w:t>5</w:t>
+              <w:t>B5</w:t>
             </w:r>
           </w:p>
         </w:tc>
@@ -694,7 +1325,7 @@
           </w:tcPr>
           <w:p>
             <w:r>
-              <w:t>6</w:t>
+              <w:t>B6</w:t>
             </w:r>
           </w:p>
         </w:tc>
@@ -783,7 +1414,7 @@
           </w:tcPr>
           <w:p>
             <w:r>
-              <w:t>7</w:t>
+              <w:t>B7</w:t>
             </w:r>
           </w:p>
         </w:tc>
@@ -835,7 +1466,7 @@
               </w:numPr>
             </w:pPr>
             <w:r>
-              <w:t>Frontend: tsc, eslint sạch; jest 52/52 đạt; 23 kịch bản trình duyệt (Playwright) đạt</w:t>
+              <w:t>Frontend: tsc, eslint sạch; jest 127/127 đạt (sau phần A); 23 kịch bản trình duyệt (Playwright) đạt</w:t>
             </w:r>
           </w:p>
           <w:p>
@@ -866,7 +1497,7 @@
               </w:numPr>
             </w:pPr>
             <w:r>
-              <w:t>Mở PR vào develop sau khi PR Buổi 4 (#41) được merge</w:t>
+              <w:t>Gộp vào develop theo thứ tự Dev 4 → Dev 1 → Dev 3 → Dev 2 (§2.4) – bước của nhóm</w:t>
             </w:r>
           </w:p>
         </w:tc>

</xml_diff>

<commit_message>
docs(lab05): update commit hashes of part A in Lab 05 report
</commit_message>
<xml_diff>
--- a/SPEC/BAO_CAO_LAB_05_2314291_DoanHongTien.docx
+++ b/SPEC/BAO_CAO_LAB_05_2314291_DoanHongTien.docx
@@ -229,7 +229,7 @@
                 <w:color w:val="0563C1"/>
                 <w:u w:val="single"/>
               </w:rPr>
-              <w:t xml:space="preserve">Commit: https://github.com/ThangThieng/Phat_trien_ung_dung_web_nang_cao/commit/4de3141</w:t>
+              <w:t>Commit: https://github.com/ThangThieng/Phat_trien_ung_dung_web_nang_cao/commit/95affc8</w:t>
             </w:r>
           </w:p>
         </w:tc>
@@ -348,7 +348,7 @@
                 <w:color w:val="0563C1"/>
                 <w:u w:val="single"/>
               </w:rPr>
-              <w:t xml:space="preserve">Commit: https://github.com/ThangThieng/Phat_trien_ung_dung_web_nang_cao/commit/4de3141</w:t>
+              <w:t>Commit: https://github.com/ThangThieng/Phat_trien_ung_dung_web_nang_cao/commit/95affc8</w:t>
             </w:r>
           </w:p>
         </w:tc>
@@ -456,7 +456,7 @@
                 <w:color w:val="0563C1"/>
                 <w:u w:val="single"/>
               </w:rPr>
-              <w:t xml:space="preserve">Commit: https://github.com/ThangThieng/Phat_trien_ung_dung_web_nang_cao/commit/4de3141</w:t>
+              <w:t>Commit: https://github.com/ThangThieng/Phat_trien_ung_dung_web_nang_cao/commit/95affc8</w:t>
             </w:r>
           </w:p>
         </w:tc>
@@ -595,7 +595,7 @@
                 <w:color w:val="0563C1"/>
                 <w:u w:val="single"/>
               </w:rPr>
-              <w:t xml:space="preserve">Commit: https://github.com/ThangThieng/Phat_trien_ung_dung_web_nang_cao/commit/4d63685 (gộp b9acca2)</w:t>
+              <w:t>Commit: https://github.com/ThangThieng/Phat_trien_ung_dung_web_nang_cao/commit/976ba56 (gộp b9acca2)</w:t>
             </w:r>
           </w:p>
           <w:p>
@@ -604,7 +604,7 @@
                 <w:color w:val="0563C1"/>
                 <w:u w:val="single"/>
               </w:rPr>
-              <w:t xml:space="preserve">Commit: https://github.com/ThangThieng/Phat_trien_ung_dung_web_nang_cao/commit/4de3141</w:t>
+              <w:t>Commit: https://github.com/ThangThieng/Phat_trien_ung_dung_web_nang_cao/commit/95affc8</w:t>
             </w:r>
           </w:p>
         </w:tc>
@@ -743,7 +743,7 @@
                 <w:color w:val="0563C1"/>
                 <w:u w:val="single"/>
               </w:rPr>
-              <w:t xml:space="preserve">Commit: https://github.com/ThangThieng/Phat_trien_ung_dung_web_nang_cao/commit/4de3141</w:t>
+              <w:t>Commit: https://github.com/ThangThieng/Phat_trien_ung_dung_web_nang_cao/commit/95affc8</w:t>
             </w:r>
           </w:p>
         </w:tc>

</xml_diff>